<commit_message>
modificare db nui, serie unice, nui din 10 cifre
</commit_message>
<xml_diff>
--- a/template/fisa_service.docx
+++ b/template/fisa_service.docx
@@ -133,6 +133,7 @@
         </w:rPr>
       </w:pPr>
       <w:proofErr w:type="spellStart"/>
+      <w:proofErr w:type="gramStart"/>
       <w:r>
         <w:rPr>
           <w:rFonts w:ascii="Arial" w:hAnsi="Arial" w:cs="Arial"/>
@@ -151,6 +152,7 @@
         <w:t>: {</w:t>
       </w:r>
       <w:proofErr w:type="spellStart"/>
+      <w:proofErr w:type="gramEnd"/>
       <w:r>
         <w:rPr>
           <w:rFonts w:ascii="Arial" w:hAnsi="Arial" w:cs="Arial"/>
@@ -179,13 +181,23 @@
           <w:szCs w:val="23"/>
         </w:rPr>
       </w:pPr>
-      <w:r>
-        <w:rPr>
-          <w:rFonts w:ascii="Arial" w:hAnsi="Arial" w:cs="Arial"/>
-          <w:sz w:val="23"/>
-          <w:szCs w:val="23"/>
-        </w:rPr>
-        <w:t>Cui: {Cui}</w:t>
+      <w:proofErr w:type="gramStart"/>
+      <w:r>
+        <w:rPr>
+          <w:rFonts w:ascii="Arial" w:hAnsi="Arial" w:cs="Arial"/>
+          <w:sz w:val="23"/>
+          <w:szCs w:val="23"/>
+        </w:rPr>
+        <w:t>Cui: {</w:t>
+      </w:r>
+      <w:proofErr w:type="gramEnd"/>
+      <w:r>
+        <w:rPr>
+          <w:rFonts w:ascii="Arial" w:hAnsi="Arial" w:cs="Arial"/>
+          <w:sz w:val="23"/>
+          <w:szCs w:val="23"/>
+        </w:rPr>
+        <w:t>Cui}</w:t>
       </w:r>
     </w:p>
     <w:p>
@@ -199,6 +211,7 @@
         </w:rPr>
       </w:pPr>
       <w:proofErr w:type="spellStart"/>
+      <w:proofErr w:type="gramStart"/>
       <w:r>
         <w:rPr>
           <w:rFonts w:ascii="Arial" w:hAnsi="Arial" w:cs="Arial"/>
@@ -217,6 +230,7 @@
         <w:t>: {</w:t>
       </w:r>
       <w:proofErr w:type="spellStart"/>
+      <w:proofErr w:type="gramEnd"/>
       <w:r>
         <w:rPr>
           <w:rFonts w:ascii="Arial" w:hAnsi="Arial" w:cs="Arial"/>
@@ -251,9 +265,19 @@
           <w:sz w:val="23"/>
           <w:szCs w:val="23"/>
         </w:rPr>
-        <w:t>PL:  {</w:t>
-      </w:r>
-      <w:proofErr w:type="spellStart"/>
+        <w:t>PL</w:t>
+      </w:r>
+      <w:proofErr w:type="gramStart"/>
+      <w:r>
+        <w:rPr>
+          <w:rFonts w:ascii="Arial" w:hAnsi="Arial" w:cs="Arial"/>
+          <w:sz w:val="23"/>
+          <w:szCs w:val="23"/>
+        </w:rPr>
+        <w:t>:  {</w:t>
+      </w:r>
+      <w:proofErr w:type="spellStart"/>
+      <w:proofErr w:type="gramEnd"/>
       <w:r>
         <w:rPr>
           <w:rFonts w:ascii="Arial" w:hAnsi="Arial" w:cs="Arial"/>
@@ -288,9 +312,19 @@
           <w:sz w:val="23"/>
           <w:szCs w:val="23"/>
         </w:rPr>
-        <w:t>TEL:  {</w:t>
-      </w:r>
-      <w:proofErr w:type="spellStart"/>
+        <w:t>TEL</w:t>
+      </w:r>
+      <w:proofErr w:type="gramStart"/>
+      <w:r>
+        <w:rPr>
+          <w:rFonts w:ascii="Arial" w:hAnsi="Arial" w:cs="Arial"/>
+          <w:sz w:val="23"/>
+          <w:szCs w:val="23"/>
+        </w:rPr>
+        <w:t>:  {</w:t>
+      </w:r>
+      <w:proofErr w:type="spellStart"/>
+      <w:proofErr w:type="gramEnd"/>
       <w:r>
         <w:rPr>
           <w:rFonts w:ascii="Arial" w:hAnsi="Arial" w:cs="Arial"/>
@@ -526,6 +560,7 @@
         <w:t>Model_Amef</w:t>
       </w:r>
       <w:proofErr w:type="spellEnd"/>
+      <w:proofErr w:type="gramStart"/>
       <w:r>
         <w:rPr>
           <w:rFonts w:ascii="Arial" w:hAnsi="Arial" w:cs="Arial"/>
@@ -549,6 +584,14 @@
           <w:szCs w:val="23"/>
         </w:rPr>
         <w:tab/>
+      </w:r>
+      <w:proofErr w:type="gramEnd"/>
+      <w:r>
+        <w:rPr>
+          <w:rFonts w:ascii="Arial" w:hAnsi="Arial" w:cs="Arial"/>
+          <w:sz w:val="23"/>
+          <w:szCs w:val="23"/>
+        </w:rPr>
         <w:t xml:space="preserve"> </w:t>
       </w:r>
       <w:r>
@@ -577,6 +620,7 @@
         <w:t>fabricatie</w:t>
       </w:r>
       <w:proofErr w:type="spellEnd"/>
+      <w:proofErr w:type="gramStart"/>
       <w:r>
         <w:rPr>
           <w:rFonts w:ascii="Arial" w:hAnsi="Arial" w:cs="Arial"/>
@@ -586,6 +630,7 @@
         <w:t>:  {</w:t>
       </w:r>
       <w:proofErr w:type="spellStart"/>
+      <w:proofErr w:type="gramEnd"/>
       <w:r>
         <w:rPr>
           <w:rFonts w:ascii="Arial" w:hAnsi="Arial" w:cs="Arial"/>
@@ -629,6 +674,14 @@
           <w:sz w:val="23"/>
           <w:szCs w:val="23"/>
         </w:rPr>
+        <w:t>:</w:t>
+      </w:r>
+      <w:r>
+        <w:rPr>
+          <w:rFonts w:ascii="Arial" w:hAnsi="Arial" w:cs="Arial"/>
+          <w:sz w:val="23"/>
+          <w:szCs w:val="23"/>
+        </w:rPr>
         <w:t xml:space="preserve"> DA / NU</w:t>
       </w:r>
       <w:r>
@@ -718,6 +771,7 @@
         <w:t xml:space="preserve"> </w:t>
       </w:r>
       <w:proofErr w:type="spellStart"/>
+      <w:proofErr w:type="gramStart"/>
       <w:r>
         <w:rPr>
           <w:rFonts w:ascii="Arial" w:hAnsi="Arial" w:cs="Arial"/>
@@ -741,7 +795,16 @@
           <w:sz w:val="23"/>
           <w:szCs w:val="23"/>
         </w:rPr>
-        <w:t>……………………………………………………………………………………….</w:t>
+        <w:t>…</w:t>
+      </w:r>
+      <w:proofErr w:type="gramEnd"/>
+      <w:r>
+        <w:rPr>
+          <w:rFonts w:ascii="Arial" w:hAnsi="Arial" w:cs="Arial"/>
+          <w:sz w:val="23"/>
+          <w:szCs w:val="23"/>
+        </w:rPr>
+        <w:t>…………………………………………………………………………………….</w:t>
       </w:r>
     </w:p>
     <w:p>
@@ -925,8 +988,18 @@
           <w:sz w:val="23"/>
           <w:szCs w:val="23"/>
         </w:rPr>
-        <w:t>………………………………………..</w:t>
-      </w:r>
+        <w:t>……………………………………</w:t>
+      </w:r>
+      <w:proofErr w:type="gramStart"/>
+      <w:r>
+        <w:rPr>
+          <w:rFonts w:ascii="Arial" w:hAnsi="Arial" w:cs="Arial"/>
+          <w:sz w:val="23"/>
+          <w:szCs w:val="23"/>
+        </w:rPr>
+        <w:t>…..</w:t>
+      </w:r>
+      <w:proofErr w:type="gramEnd"/>
     </w:p>
     <w:p>
       <w:pPr>
@@ -937,94 +1010,6 @@
           <w:szCs w:val="23"/>
         </w:rPr>
       </w:pPr>
-      <w:proofErr w:type="spellStart"/>
-      <w:r>
-        <w:rPr>
-          <w:rFonts w:ascii="Arial" w:hAnsi="Arial" w:cs="Arial"/>
-          <w:sz w:val="23"/>
-          <w:szCs w:val="23"/>
-        </w:rPr>
-        <w:t>Aparatul</w:t>
-      </w:r>
-      <w:proofErr w:type="spellEnd"/>
-      <w:r>
-        <w:rPr>
-          <w:rFonts w:ascii="Arial" w:hAnsi="Arial" w:cs="Arial"/>
-          <w:sz w:val="23"/>
-          <w:szCs w:val="23"/>
-        </w:rPr>
-        <w:t xml:space="preserve"> are </w:t>
-      </w:r>
-      <w:proofErr w:type="spellStart"/>
-      <w:r>
-        <w:rPr>
-          <w:rFonts w:ascii="Arial" w:hAnsi="Arial" w:cs="Arial"/>
-          <w:sz w:val="23"/>
-          <w:szCs w:val="23"/>
-        </w:rPr>
-        <w:t>urmatoarele</w:t>
-      </w:r>
-      <w:proofErr w:type="spellEnd"/>
-      <w:r>
-        <w:rPr>
-          <w:rFonts w:ascii="Arial" w:hAnsi="Arial" w:cs="Arial"/>
-          <w:sz w:val="23"/>
-          <w:szCs w:val="23"/>
-        </w:rPr>
-        <w:t xml:space="preserve"> </w:t>
-      </w:r>
-      <w:proofErr w:type="spellStart"/>
-      <w:r>
-        <w:rPr>
-          <w:rFonts w:ascii="Arial" w:hAnsi="Arial" w:cs="Arial"/>
-          <w:sz w:val="23"/>
-          <w:szCs w:val="23"/>
-        </w:rPr>
-        <w:t>accesorii</w:t>
-      </w:r>
-      <w:proofErr w:type="spellEnd"/>
-      <w:r>
-        <w:rPr>
-          <w:rFonts w:ascii="Arial" w:hAnsi="Arial" w:cs="Arial"/>
-          <w:sz w:val="23"/>
-          <w:szCs w:val="23"/>
-        </w:rPr>
-        <w:t xml:space="preserve">:  </w:t>
-      </w:r>
-      <w:proofErr w:type="spellStart"/>
-      <w:r>
-        <w:rPr>
-          <w:rFonts w:ascii="Arial" w:hAnsi="Arial" w:cs="Arial"/>
-          <w:sz w:val="23"/>
-          <w:szCs w:val="23"/>
-        </w:rPr>
-        <w:t>Alimentator</w:t>
-      </w:r>
-      <w:proofErr w:type="spellEnd"/>
-      <w:r>
-        <w:rPr>
-          <w:rFonts w:ascii="Arial" w:hAnsi="Arial" w:cs="Arial"/>
-          <w:sz w:val="23"/>
-          <w:szCs w:val="23"/>
-        </w:rPr>
-        <w:t xml:space="preserve"> </w:t>
-      </w:r>
-      <w:r>
-        <w:rPr>
-          <w:rFonts w:ascii="Arial" w:hAnsi="Arial" w:cs="Arial"/>
-          <w:sz w:val="23"/>
-          <w:szCs w:val="23"/>
-        </w:rPr>
-        <w:tab/>
-      </w:r>
-      <w:r>
-        <w:rPr>
-          <w:rFonts w:ascii="Arial" w:hAnsi="Arial" w:cs="Arial"/>
-          <w:sz w:val="23"/>
-          <w:szCs w:val="23"/>
-        </w:rPr>
-        <w:t>DA / NU</w:t>
-      </w:r>
     </w:p>
     <w:p>
       <w:pPr>
@@ -1159,7 +1144,25 @@
           <w:sz w:val="23"/>
           <w:szCs w:val="23"/>
         </w:rPr>
-        <w:t xml:space="preserve"> a </w:t>
+        <w:t xml:space="preserve"> </w:t>
+      </w:r>
+      <w:proofErr w:type="gramStart"/>
+      <w:r>
+        <w:rPr>
+          <w:rFonts w:ascii="Arial" w:hAnsi="Arial" w:cs="Arial"/>
+          <w:sz w:val="23"/>
+          <w:szCs w:val="23"/>
+        </w:rPr>
+        <w:t>a</w:t>
+      </w:r>
+      <w:proofErr w:type="gramEnd"/>
+      <w:r>
+        <w:rPr>
+          <w:rFonts w:ascii="Arial" w:hAnsi="Arial" w:cs="Arial"/>
+          <w:sz w:val="23"/>
+          <w:szCs w:val="23"/>
+        </w:rPr>
+        <w:t xml:space="preserve"> </w:t>
       </w:r>
       <w:proofErr w:type="spellStart"/>
       <w:r>
@@ -1177,12 +1180,24 @@
           <w:sz w:val="23"/>
           <w:szCs w:val="23"/>
         </w:rPr>
-        <w:t xml:space="preserve"> nu fac </w:t>
-      </w:r>
-      <w:proofErr w:type="spellStart"/>
-      <w:r>
-        <w:rPr>
-          <w:rFonts w:ascii="Arial" w:hAnsi="Arial" w:cs="Arial"/>
+        <w:t xml:space="preserve"> </w:t>
+      </w:r>
+      <w:r>
+        <w:rPr>
+          <w:rFonts w:ascii="Arial" w:hAnsi="Arial" w:cs="Arial"/>
+          <w:b/>
+          <w:bCs/>
+          <w:sz w:val="23"/>
+          <w:szCs w:val="23"/>
+        </w:rPr>
+        <w:t xml:space="preserve">nu fac </w:t>
+      </w:r>
+      <w:proofErr w:type="spellStart"/>
+      <w:r>
+        <w:rPr>
+          <w:rFonts w:ascii="Arial" w:hAnsi="Arial" w:cs="Arial"/>
+          <w:b/>
+          <w:bCs/>
           <w:sz w:val="23"/>
           <w:szCs w:val="23"/>
         </w:rPr>
@@ -1192,6 +1207,8 @@
       <w:r>
         <w:rPr>
           <w:rFonts w:ascii="Arial" w:hAnsi="Arial" w:cs="Arial"/>
+          <w:b/>
+          <w:bCs/>
           <w:sz w:val="23"/>
           <w:szCs w:val="23"/>
         </w:rPr>
@@ -1201,6 +1218,8 @@
       <w:r>
         <w:rPr>
           <w:rFonts w:ascii="Arial" w:hAnsi="Arial" w:cs="Arial"/>
+          <w:b/>
+          <w:bCs/>
           <w:sz w:val="23"/>
           <w:szCs w:val="23"/>
         </w:rPr>

</xml_diff>